<commit_message>
updated grade letter proposal for  echo
Signed-off-by: Rishabh Agarwal <agarwalrishabh2005@gmail.com>
</commit_message>
<xml_diff>
--- a/Iteration_2/Echo_Review/final_submission/Grade_letter_proposal.docx
+++ b/Iteration_2/Echo_Review/final_submission/Grade_letter_proposal.docx
@@ -230,7 +230,25 @@
         </w:numPr>
       </w:pPr>
       <w:r>
-        <w:t>The team often groups large abstract concepts into one class such as “Networking” which offers a broad level of services to other classes. This approach is highly flawed since coupling class together in this manner creates room for error and is highly suggested to instead split the class into subsections.</w:t>
+        <w:t xml:space="preserve">The team often groups large abstract concepts into one class such as “Networking” which offers a broad level of services to other classes. This approach is highly flawed since coupling </w:t>
+      </w:r>
+      <w:r>
+        <w:t xml:space="preserve">a </w:t>
+      </w:r>
+      <w:r>
+        <w:t>class together in this manner creates room for error</w:t>
+      </w:r>
+      <w:r>
+        <w:t>s</w:t>
+      </w:r>
+      <w:r>
+        <w:t xml:space="preserve"> and </w:t>
+      </w:r>
+      <w:r>
+        <w:t>we</w:t>
+      </w:r>
+      <w:r>
+        <w:t xml:space="preserve"> highly suggest to instead split the class into subsections.</w:t>
       </w:r>
     </w:p>
     <w:p>
@@ -496,7 +514,22 @@
         </w:numPr>
       </w:pPr>
       <w:r>
-        <w:t xml:space="preserve">A major critique is that there were too many project trackers being used for a single project. Ideally, there will be a project tracker for the whole project and sub teams can choose to make their own trackers. A single project tracker enables easier review rather than based </w:t>
+        <w:t>A major critique is that there were too many project trackers being used for a single project. Ideally, there w</w:t>
+      </w:r>
+      <w:r>
+        <w:t>ould</w:t>
+      </w:r>
+      <w:r>
+        <w:t xml:space="preserve"> be a project tracker for the whole project and sub teams can choose to make their own </w:t>
+      </w:r>
+      <w:r>
+        <w:t xml:space="preserve">trackers. A single project tracker enables easier review </w:t>
+      </w:r>
+      <w:r>
+        <w:t>rather</w:t>
+      </w:r>
+      <w:r>
+        <w:t xml:space="preserve"> than having so many trackers. The sub teams can have sub-trackers but there should be a primary tracker.</w:t>
       </w:r>
     </w:p>
     <w:p>
@@ -571,13 +604,40 @@
         <w:t xml:space="preserve"> more </w:t>
       </w:r>
       <w:r>
-        <w:t>important, and t</w:t>
-      </w:r>
-      <w:r>
-        <w:t>his is concerning</w:t>
-      </w:r>
-      <w:r>
-        <w:t xml:space="preserve"> that they spent so much time on a branch that is not really “requested” to be implemented rather a “stub” was asked. </w:t>
+        <w:t xml:space="preserve">important, and </w:t>
+      </w:r>
+      <w:r>
+        <w:t>it</w:t>
+      </w:r>
+      <w:r>
+        <w:t xml:space="preserve"> is concerning</w:t>
+      </w:r>
+      <w:r>
+        <w:t xml:space="preserve"> that they spent so much time on a branch that </w:t>
+      </w:r>
+      <w:r>
+        <w:t>was</w:t>
+      </w:r>
+      <w:r>
+        <w:t xml:space="preserve"> not really “requested” to be implemented</w:t>
+      </w:r>
+      <w:r>
+        <w:t>.</w:t>
+      </w:r>
+      <w:r>
+        <w:t xml:space="preserve"> </w:t>
+      </w:r>
+      <w:r>
+        <w:t>R</w:t>
+      </w:r>
+      <w:r>
+        <w:t>ather</w:t>
+      </w:r>
+      <w:r>
+        <w:t>,</w:t>
+      </w:r>
+      <w:r>
+        <w:t xml:space="preserve"> a “stub” was asked. </w:t>
       </w:r>
       <w:r>
         <w:t xml:space="preserve"> </w:t>
@@ -592,7 +652,7 @@
         </w:numPr>
       </w:pPr>
       <w:r>
-        <w:t xml:space="preserve">While some of the trackers were very complete, containing coherent estimated dates (that were or will be later followed on), succinct descriptions, and a well-defined timeline overall (first modeling, then coding), others were very incomplete. </w:t>
+        <w:t>Some of the trackers were highly detailed, featuring coherent estimated dates (either already followed or set to be followed later), concise descriptions, and a well-structured timeline that progressed logically from modeling to coding. In contrast, others were significantly less complete.</w:t>
       </w:r>
     </w:p>
     <w:p>
@@ -705,17 +765,17 @@
         <w:t>Project Tracker for the GUI:  S</w:t>
       </w:r>
       <w:r>
-        <w:t>ome task notes didn't really relate to what the labelled task was and/or were too vague to reliably communicate the specific work that was done.</w:t>
+        <w:t xml:space="preserve">ome task notes didn't really relate to what the labelled task was and/or were too vague to reliably communicate the specific work </w:t>
+      </w:r>
+      <w:r>
+        <w:lastRenderedPageBreak/>
+        <w:t>that was done.</w:t>
       </w:r>
       <w:r>
         <w:t xml:space="preserve"> The completion dates were filled with future dates, which could</w:t>
       </w:r>
       <w:r>
-        <w:t xml:space="preserve">'ve </w:t>
-      </w:r>
-      <w:r>
-        <w:lastRenderedPageBreak/>
-        <w:t>been left blank until completion</w:t>
+        <w:t>'ve been left blank until completion</w:t>
       </w:r>
       <w:r>
         <w:t xml:space="preserve"> or better yet: The dates could have been separated into actual and planned ones.</w:t>
@@ -803,10 +863,13 @@
         <w:t>.</w:t>
       </w:r>
       <w:r>
-        <w:t xml:space="preserve"> However, there were shortcomings with the</w:t>
-      </w:r>
-      <w:r>
-        <w:t xml:space="preserve"> some </w:t>
+        <w:t xml:space="preserve"> However, there were shortcomings with </w:t>
+      </w:r>
+      <w:r>
+        <w:t>some</w:t>
+      </w:r>
+      <w:r>
+        <w:t xml:space="preserve"> </w:t>
       </w:r>
       <w:r>
         <w:t>use cases</w:t>
@@ -849,24 +912,6 @@
       </w:r>
       <w:r>
         <w:t>.</w:t>
-      </w:r>
-    </w:p>
-    <w:p>
-      <w:pPr>
-        <w:pStyle w:val="ListParagraph"/>
-        <w:numPr>
-          <w:ilvl w:val="0"/>
-          <w:numId w:val="3"/>
-        </w:numPr>
-      </w:pPr>
-      <w:r>
-        <w:t>Considering the overemphasis on networking and the infeasibility of the networking plan it.</w:t>
-      </w:r>
-      <w:r>
-        <w:t xml:space="preserve"> There were 5+ documents for the networking which was not the primary task of the team. Whereas for backend and frontend, there were less than 5 documents. </w:t>
-      </w:r>
-      <w:r>
-        <w:t xml:space="preserve"> </w:t>
       </w:r>
     </w:p>
     <w:p>
@@ -885,6 +930,25 @@
         </w:rPr>
       </w:pPr>
       <w:r>
+        <w:t>Given the overemphasis on networking and the impracticality of the networking plan, it is notable that there were over five documents dedicated to networking—despite it not being the team's primary task. In comparison, fewer than five documents were allocated to both backend and frontend tasks.</w:t>
+      </w:r>
+    </w:p>
+    <w:p>
+      <w:pPr>
+        <w:pStyle w:val="ListParagraph"/>
+        <w:numPr>
+          <w:ilvl w:val="0"/>
+          <w:numId w:val="3"/>
+        </w:numPr>
+        <w:spacing w:after="0" w:line="240" w:lineRule="auto"/>
+        <w:rPr>
+          <w:rFonts w:eastAsia="Times New Roman" w:cs="Times New Roman"/>
+          <w:kern w:val="0"/>
+          <w:lang w:eastAsia="en-CA"/>
+          <w14:ligatures w14:val="none"/>
+        </w:rPr>
+      </w:pPr>
+      <w:r>
         <w:rPr>
           <w:rFonts w:eastAsia="Times New Roman" w:cs="Courier New"/>
           <w:color w:val="000000"/>
@@ -892,7 +956,7 @@
           <w:lang w:eastAsia="en-CA"/>
           <w14:ligatures w14:val="none"/>
         </w:rPr>
-        <w:t xml:space="preserve">There is clear passion and ambition as we see they want to create an actual dedicated server, as to a stub from the CEO’s letter. We applaud the </w:t>
+        <w:t>There is clear passion and ambition as we see they want to create an actual dedicated server, as</w:t>
       </w:r>
       <w:r>
         <w:rPr>
@@ -902,6 +966,46 @@
           <w:lang w:eastAsia="en-CA"/>
           <w14:ligatures w14:val="none"/>
         </w:rPr>
+        <w:t xml:space="preserve"> opposed</w:t>
+      </w:r>
+      <w:r>
+        <w:rPr>
+          <w:rFonts w:eastAsia="Times New Roman" w:cs="Courier New"/>
+          <w:color w:val="000000"/>
+          <w:kern w:val="0"/>
+          <w:lang w:eastAsia="en-CA"/>
+          <w14:ligatures w14:val="none"/>
+        </w:rPr>
+        <w:t xml:space="preserve"> to a stub </w:t>
+      </w:r>
+      <w:r>
+        <w:rPr>
+          <w:rFonts w:eastAsia="Times New Roman" w:cs="Courier New"/>
+          <w:color w:val="000000"/>
+          <w:kern w:val="0"/>
+          <w:lang w:eastAsia="en-CA"/>
+          <w14:ligatures w14:val="none"/>
+        </w:rPr>
+        <w:t xml:space="preserve">that was required </w:t>
+      </w:r>
+      <w:r>
+        <w:rPr>
+          <w:rFonts w:eastAsia="Times New Roman" w:cs="Courier New"/>
+          <w:color w:val="000000"/>
+          <w:kern w:val="0"/>
+          <w:lang w:eastAsia="en-CA"/>
+          <w14:ligatures w14:val="none"/>
+        </w:rPr>
+        <w:t xml:space="preserve">from the CEO’s letter. We applaud the </w:t>
+      </w:r>
+      <w:r>
+        <w:rPr>
+          <w:rFonts w:eastAsia="Times New Roman" w:cs="Courier New"/>
+          <w:color w:val="000000"/>
+          <w:kern w:val="0"/>
+          <w:lang w:eastAsia="en-CA"/>
+          <w14:ligatures w14:val="none"/>
+        </w:rPr>
         <w:t>ambition,</w:t>
       </w:r>
       <w:r>
@@ -1042,7 +1146,7 @@
           <w:lang w:eastAsia="en-CA"/>
           <w14:ligatures w14:val="none"/>
         </w:rPr>
-        <w:t xml:space="preserve"> over ambition </w:t>
+        <w:t xml:space="preserve"> overambiti</w:t>
       </w:r>
       <w:r>
         <w:rPr>
@@ -1052,6 +1156,26 @@
           <w:lang w:eastAsia="en-CA"/>
           <w14:ligatures w14:val="none"/>
         </w:rPr>
+        <w:t>ous</w:t>
+      </w:r>
+      <w:r>
+        <w:rPr>
+          <w:rFonts w:eastAsia="Times New Roman" w:cs="Courier New"/>
+          <w:color w:val="000000"/>
+          <w:kern w:val="0"/>
+          <w:lang w:eastAsia="en-CA"/>
+          <w14:ligatures w14:val="none"/>
+        </w:rPr>
+        <w:t xml:space="preserve"> </w:t>
+      </w:r>
+      <w:r>
+        <w:rPr>
+          <w:rFonts w:eastAsia="Times New Roman" w:cs="Courier New"/>
+          <w:color w:val="000000"/>
+          <w:kern w:val="0"/>
+          <w:lang w:eastAsia="en-CA"/>
+          <w14:ligatures w14:val="none"/>
+        </w:rPr>
         <w:t xml:space="preserve">for the planning </w:t>
       </w:r>
       <w:r>
@@ -1075,7 +1199,13 @@
         <w:t xml:space="preserve"> C</w:t>
       </w:r>
       <w:r>
-        <w:t xml:space="preserve">onsidering everything holistically and the case that they neglected other parts of the project </w:t>
+        <w:t>onsidering everything holistically</w:t>
+      </w:r>
+      <w:r>
+        <w:t>,</w:t>
+      </w:r>
+      <w:r>
+        <w:t xml:space="preserve"> and the case that they neglected other parts of the project </w:t>
       </w:r>
       <w:r>
         <w:t xml:space="preserve">we think their </w:t>
@@ -2178,6 +2308,7 @@
   <w:style w:type="character" w:default="1" w:styleId="DefaultParagraphFont">
     <w:name w:val="Default Paragraph Font"/>
     <w:uiPriority w:val="1"/>
+    <w:semiHidden/>
     <w:unhideWhenUsed/>
   </w:style>
   <w:style w:type="table" w:default="1" w:styleId="TableNormal">

</xml_diff>